<commit_message>
Update Zenodo DOI for Frontiers package
</commit_message>
<xml_diff>
--- a/submission_packages/frontiers_signal_processing_20260601/01_manuscript_frontiers_full/Frontiers_Original_Research_Manuscript.docx
+++ b/submission_packages/frontiers_signal_processing_20260601/01_manuscript_frontiers_full/Frontiers_Original_Research_Manuscript.docx
@@ -408,7 +408,7 @@
     </w:p>
     <w:p>
       <w:r>
-        <w:t>The primary CTU-UHB/CTU-CHB dataset is publicly available through PhysioNet [goldberger2000,chudacek2014,ctuuhb]. CTGDL-FHRMA is available through its public Zenodo record with subset-specific access caveats [ctgdl]. UCI Cardiotocography is available through the UCI Machine Learning Repository [uci]. Derived figure source-data tables, supplementary CSV tables, the fixed record-level split and reviewer-sensitivity tables are available in the project repository at https://github.com/Luciky-Leo/ctg-foundation-trajectory and in the versioned Zenodo archive at https://doi.org/10.5281/zenodo.20376424. The repository name is historical and does not imply that the model is a foundation model.</w:t>
+        <w:t>The primary CTU-UHB/CTU-CHB dataset is publicly available through PhysioNet [goldberger2000,chudacek2014,ctuuhb]. CTGDL-FHRMA is available through its public Zenodo record with subset-specific access caveats [ctgdl]. UCI Cardiotocography is available through the UCI Machine Learning Repository [uci]. Derived figure source-data tables, supplementary CSV tables, the fixed record-level split and reviewer-sensitivity tables are available in the project repository at https://github.com/Luciky-Leo/ctg-foundation-trajectory and in the versioned Zenodo archive at https://doi.org/10.5281/zenodo.20484443. The repository name is historical and does not imply that the model is a foundation model.</w:t>
       </w:r>
     </w:p>
     <w:p>
@@ -421,7 +421,7 @@
     </w:p>
     <w:p>
       <w:r>
-        <w:t>The analysis code and manuscript source package are available at https://github.com/Luciky-Leo/ctg-foundation-trajectory. A versioned archival release is available at https://doi.org/10.5281/zenodo.20376424. The local analysis pipeline is organized under scripts/. The transformer SSL encoder was trained by scripts/04_models/train_transformer_ssl_encoder.py; downstream embeddings, phenotypes, validation, recalibration, reviewer-requested sensitivity analyses and figure source-data tables were generated by the remaining scripts in scripts/04_models/ and scripts/05_reports/. Manuscript figures were generated by scripts/05_reports/build_manuscript_figures.py. Figure legends, Results text, Methods text, and supplementary tables were generated by scripts/05_reports/build_manuscript_text_and_supplement.py. The repository includes figure source-data tables, supplementary CSV tables, the fixed record-level split, the TRIPOD+AI checklist and the reviewer-sensitivity table.</w:t>
+        <w:t>The analysis code and manuscript source package are available at https://github.com/Luciky-Leo/ctg-foundation-trajectory. A versioned archival release is available at https://doi.org/10.5281/zenodo.20484443. The local analysis pipeline is organized under scripts/. The transformer SSL encoder was trained by scripts/04_models/train_transformer_ssl_encoder.py; downstream embeddings, phenotypes, validation, recalibration, reviewer-requested sensitivity analyses and figure source-data tables were generated by the remaining scripts in scripts/04_models/ and scripts/05_reports/. Manuscript figures were generated by scripts/05_reports/build_manuscript_figures.py. Figure legends, Results text, Methods text, and supplementary tables were generated by scripts/05_reports/build_manuscript_text_and_supplement.py. The repository includes figure source-data tables, supplementary CSV tables, the fixed record-level split, the TRIPOD+AI checklist and the reviewer-sensitivity table.</w:t>
       </w:r>
     </w:p>
     <w:p>
@@ -434,7 +434,7 @@
     </w:p>
     <w:p>
       <w:r>
-        <w:t>The CTU-UHB/CTU-CHB dataset is publicly available through PhysioNet. CTGDL-FHRMA is available through its public Zenodo record with subset-specific access caveats. UCI Cardiotocography is available through the UCI Machine Learning Repository. Derived figure source-data tables, supplementary CSV tables, the fixed record-level split and reviewer-sensitivity tables are available in the project repository at https://github.com/Luciky-Leo/ctg-foundation-trajectory and in the versioned Zenodo archive at https://doi.org/10.5281/zenodo.20376424. The repository name is historical and does not imply that the model is a foundation model.</w:t>
+        <w:t>The CTU-UHB/CTU-CHB dataset is publicly available through PhysioNet. CTGDL-FHRMA is available through its public Zenodo record with subset-specific access caveats. UCI Cardiotocography is available through the UCI Machine Learning Repository. Derived figure source-data tables, supplementary CSV tables, the fixed record-level split and reviewer-sensitivity tables are available in the project repository at https://github.com/Luciky-Leo/ctg-foundation-trajectory and in the versioned Zenodo archive at https://doi.org/10.5281/zenodo.20484443. The repository name is historical and does not imply that the model is a foundation model.</w:t>
       </w:r>
     </w:p>
     <w:p>

</xml_diff>

<commit_message>
Update final Zenodo DOI
</commit_message>
<xml_diff>
--- a/submission_packages/frontiers_signal_processing_20260601/01_manuscript_frontiers_full/Frontiers_Original_Research_Manuscript.docx
+++ b/submission_packages/frontiers_signal_processing_20260601/01_manuscript_frontiers_full/Frontiers_Original_Research_Manuscript.docx
@@ -408,7 +408,7 @@
     </w:p>
     <w:p>
       <w:r>
-        <w:t>The primary CTU-UHB/CTU-CHB dataset is publicly available through PhysioNet [goldberger2000,chudacek2014,ctuuhb]. CTGDL-FHRMA is available through its public Zenodo record with subset-specific access caveats [ctgdl]. UCI Cardiotocography is available through the UCI Machine Learning Repository [uci]. Derived figure source-data tables, supplementary CSV tables, the fixed record-level split and reviewer-sensitivity tables are available in the project repository at https://github.com/Luciky-Leo/ctg-foundation-trajectory and in the versioned Zenodo archive at https://doi.org/10.5281/zenodo.20484443. The repository name is historical and does not imply that the model is a foundation model.</w:t>
+        <w:t>The primary CTU-UHB/CTU-CHB dataset is publicly available through PhysioNet [goldberger2000,chudacek2014,ctuuhb]. CTGDL-FHRMA is available through its public Zenodo record with subset-specific access caveats [ctgdl]. UCI Cardiotocography is available through the UCI Machine Learning Repository [uci]. Derived figure source-data tables, supplementary CSV tables, the fixed record-level split and reviewer-sensitivity tables are available in the project repository at https://github.com/Luciky-Leo/ctg-foundation-trajectory and in the versioned Zenodo archive at https://doi.org/10.5281/zenodo.20485068. The repository name is historical and does not imply that the model is a foundation model.</w:t>
       </w:r>
     </w:p>
     <w:p>
@@ -421,7 +421,7 @@
     </w:p>
     <w:p>
       <w:r>
-        <w:t>The analysis code and manuscript source package are available at https://github.com/Luciky-Leo/ctg-foundation-trajectory. A versioned archival release is available at https://doi.org/10.5281/zenodo.20484443. The local analysis pipeline is organized under scripts/. The transformer SSL encoder was trained by scripts/04_models/train_transformer_ssl_encoder.py; downstream embeddings, phenotypes, validation, recalibration, reviewer-requested sensitivity analyses and figure source-data tables were generated by the remaining scripts in scripts/04_models/ and scripts/05_reports/. Manuscript figures were generated by scripts/05_reports/build_manuscript_figures.py. Figure legends, Results text, Methods text, and supplementary tables were generated by scripts/05_reports/build_manuscript_text_and_supplement.py. The repository includes figure source-data tables, supplementary CSV tables, the fixed record-level split, the TRIPOD+AI checklist and the reviewer-sensitivity table.</w:t>
+        <w:t>The analysis code and manuscript source package are available at https://github.com/Luciky-Leo/ctg-foundation-trajectory. A versioned archival release is available at https://doi.org/10.5281/zenodo.20485068. The local analysis pipeline is organized under scripts/. The transformer SSL encoder was trained by scripts/04_models/train_transformer_ssl_encoder.py; downstream embeddings, phenotypes, validation, recalibration, reviewer-requested sensitivity analyses and figure source-data tables were generated by the remaining scripts in scripts/04_models/ and scripts/05_reports/. Manuscript figures were generated by scripts/05_reports/build_manuscript_figures.py. Figure legends, Results text, Methods text, and supplementary tables were generated by scripts/05_reports/build_manuscript_text_and_supplement.py. The repository includes figure source-data tables, supplementary CSV tables, the fixed record-level split, the TRIPOD+AI checklist and the reviewer-sensitivity table.</w:t>
       </w:r>
     </w:p>
     <w:p>
@@ -434,7 +434,7 @@
     </w:p>
     <w:p>
       <w:r>
-        <w:t>The CTU-UHB/CTU-CHB dataset is publicly available through PhysioNet. CTGDL-FHRMA is available through its public Zenodo record with subset-specific access caveats. UCI Cardiotocography is available through the UCI Machine Learning Repository. Derived figure source-data tables, supplementary CSV tables, the fixed record-level split and reviewer-sensitivity tables are available in the project repository at https://github.com/Luciky-Leo/ctg-foundation-trajectory and in the versioned Zenodo archive at https://doi.org/10.5281/zenodo.20484443. The repository name is historical and does not imply that the model is a foundation model.</w:t>
+        <w:t>The CTU-UHB/CTU-CHB dataset is publicly available through PhysioNet. CTGDL-FHRMA is available through its public Zenodo record with subset-specific access caveats. UCI Cardiotocography is available through the UCI Machine Learning Repository. Derived figure source-data tables, supplementary CSV tables, the fixed record-level split and reviewer-sensitivity tables are available in the project repository at https://github.com/Luciky-Leo/ctg-foundation-trajectory and in the versioned Zenodo archive at https://doi.org/10.5281/zenodo.20485068. The repository name is historical and does not imply that the model is a foundation model.</w:t>
       </w:r>
     </w:p>
     <w:p>

</xml_diff>